<commit_message>
Build named documents from source, remove redundant pre-built files
- Add build rules for standalone .md and .html documents (named-docs target)
- Remove pre-built PDF/DOCX from papers/ that are now built from source
- Keep Rev 2 white paper as frozen artifact (no source, copied via sync-sources)
- Fix root Makefile: replace broken %: match-anything rule with explicit target list
- Fix README: HTML link → GitHub Pages URL, remove dead Rev 2 MD link
- Rebuild all dist/ from clean

Co-Authored-By: Claude Opus 4.6 <noreply@anthropic.com>
</commit_message>
<xml_diff>
--- a/dist/entfesselt.docx
+++ b/dist/entfesselt.docx
@@ -7,7 +7,31 @@
         <w:pStyle w:val="Title"/>
       </w:pPr>
       <w:r>
-        <w:t xml:space="preserve">The</w:t>
+        <w:t xml:space="preserve">Vom</w:t>
+      </w:r>
+      <w:r>
+        <w:t xml:space="preserve"> </w:t>
+      </w:r>
+      <w:r>
+        <w:t xml:space="preserve">Wagner</w:t>
+      </w:r>
+      <w:r>
+        <w:t xml:space="preserve"> </w:t>
+      </w:r>
+      <w:r>
+        <w:t xml:space="preserve">zum</w:t>
+      </w:r>
+      <w:r>
+        <w:t xml:space="preserve"> </w:t>
+      </w:r>
+      <w:r>
+        <w:t xml:space="preserve">Walther:</w:t>
+      </w:r>
+      <w:r>
+        <w:t xml:space="preserve"> </w:t>
+      </w:r>
+      <w:r>
+        <w:t xml:space="preserve">Siegfried</w:t>
       </w:r>
       <w:r>
         <w:t xml:space="preserve"> </w:t>
@@ -15,11 +39,43 @@
       <w:r>
         <w:t xml:space="preserve">Entfesselt</w:t>
       </w:r>
-      <w:r>
-        <w:t xml:space="preserve"> </w:t>
-      </w:r>
-      <w:r>
-        <w:t xml:space="preserve">Papers</w:t>
+    </w:p>
+    <w:p>
+      <w:pPr>
+        <w:pStyle w:val="Subtitle"/>
+      </w:pPr>
+      <w:r>
+        <w:t xml:space="preserve">Liberating</w:t>
+      </w:r>
+      <w:r>
+        <w:t xml:space="preserve"> </w:t>
+      </w:r>
+      <w:r>
+        <w:t xml:space="preserve">Old</w:t>
+      </w:r>
+      <w:r>
+        <w:t xml:space="preserve"> </w:t>
+      </w:r>
+      <w:r>
+        <w:t xml:space="preserve">Norse</w:t>
+      </w:r>
+      <w:r>
+        <w:t xml:space="preserve"> </w:t>
+      </w:r>
+      <w:r>
+        <w:t xml:space="preserve">from</w:t>
+      </w:r>
+      <w:r>
+        <w:t xml:space="preserve"> </w:t>
+      </w:r>
+      <w:r>
+        <w:t xml:space="preserve">Italian</w:t>
+      </w:r>
+      <w:r>
+        <w:t xml:space="preserve"> </w:t>
+      </w:r>
+      <w:r>
+        <w:t xml:space="preserve">Grammar</w:t>
       </w:r>
     </w:p>
     <w:p>
@@ -57,13 +113,669 @@
         <w:pStyle w:val="Abstract"/>
       </w:pPr>
       <w:r>
-        <w:t xml:space="preserve">[Replace</w:t>
-      </w:r>
-      <w:r>
-        <w:t xml:space="preserve"> </w:t>
-      </w:r>
-      <w:r>
-        <w:t xml:space="preserve">this</w:t>
+        <w:t xml:space="preserve">German,</w:t>
+      </w:r>
+      <w:r>
+        <w:t xml:space="preserve"> </w:t>
+      </w:r>
+      <w:r>
+        <w:t xml:space="preserve">Dutch,</w:t>
+      </w:r>
+      <w:r>
+        <w:t xml:space="preserve"> </w:t>
+      </w:r>
+      <w:r>
+        <w:t xml:space="preserve">Danish,</w:t>
+      </w:r>
+      <w:r>
+        <w:t xml:space="preserve"> </w:t>
+      </w:r>
+      <w:r>
+        <w:t xml:space="preserve">Swedish,</w:t>
+      </w:r>
+      <w:r>
+        <w:t xml:space="preserve"> </w:t>
+      </w:r>
+      <w:r>
+        <w:t xml:space="preserve">Norwegian,</w:t>
+      </w:r>
+      <w:r>
+        <w:t xml:space="preserve"> </w:t>
+      </w:r>
+      <w:r>
+        <w:t xml:space="preserve">Icelandic,</w:t>
+      </w:r>
+      <w:r>
+        <w:t xml:space="preserve"> </w:t>
+      </w:r>
+      <w:r>
+        <w:t xml:space="preserve">and</w:t>
+      </w:r>
+      <w:r>
+        <w:t xml:space="preserve"> </w:t>
+      </w:r>
+      <w:r>
+        <w:t xml:space="preserve">English</w:t>
+      </w:r>
+      <w:r>
+        <w:t xml:space="preserve"> </w:t>
+      </w:r>
+      <w:r>
+        <w:t xml:space="preserve">are</w:t>
+      </w:r>
+      <w:r>
+        <w:t xml:space="preserve"> </w:t>
+      </w:r>
+      <w:r>
+        <w:t xml:space="preserve">distinct</w:t>
+      </w:r>
+      <w:r>
+        <w:t xml:space="preserve"> </w:t>
+      </w:r>
+      <w:r>
+        <w:t xml:space="preserve">but</w:t>
+      </w:r>
+      <w:r>
+        <w:t xml:space="preserve"> </w:t>
+      </w:r>
+      <w:r>
+        <w:t xml:space="preserve">related</w:t>
+      </w:r>
+      <w:r>
+        <w:t xml:space="preserve"> </w:t>
+      </w:r>
+      <w:r>
+        <w:t xml:space="preserve">languages.</w:t>
+      </w:r>
+      <w:r>
+        <w:t xml:space="preserve"> </w:t>
+      </w:r>
+      <w:r>
+        <w:t xml:space="preserve">Their</w:t>
+      </w:r>
+      <w:r>
+        <w:t xml:space="preserve"> </w:t>
+      </w:r>
+      <w:r>
+        <w:t xml:space="preserve">standard</w:t>
+      </w:r>
+      <w:r>
+        <w:t xml:space="preserve"> </w:t>
+      </w:r>
+      <w:r>
+        <w:t xml:space="preserve">written</w:t>
+      </w:r>
+      <w:r>
+        <w:t xml:space="preserve"> </w:t>
+      </w:r>
+      <w:r>
+        <w:t xml:space="preserve">forms</w:t>
+      </w:r>
+      <w:r>
+        <w:t xml:space="preserve"> </w:t>
+      </w:r>
+      <w:r>
+        <w:t xml:space="preserve">make</w:t>
+      </w:r>
+      <w:r>
+        <w:t xml:space="preserve"> </w:t>
+      </w:r>
+      <w:r>
+        <w:t xml:space="preserve">them</w:t>
+      </w:r>
+      <w:r>
+        <w:t xml:space="preserve"> </w:t>
+      </w:r>
+      <w:r>
+        <w:t xml:space="preserve">look</w:t>
+      </w:r>
+      <w:r>
+        <w:t xml:space="preserve"> </w:t>
+      </w:r>
+      <w:r>
+        <w:t xml:space="preserve">further</w:t>
+      </w:r>
+      <w:r>
+        <w:t xml:space="preserve"> </w:t>
+      </w:r>
+      <w:r>
+        <w:t xml:space="preserve">apart</w:t>
+      </w:r>
+      <w:r>
+        <w:t xml:space="preserve"> </w:t>
+      </w:r>
+      <w:r>
+        <w:t xml:space="preserve">than</w:t>
+      </w:r>
+      <w:r>
+        <w:t xml:space="preserve"> </w:t>
+      </w:r>
+      <w:r>
+        <w:t xml:space="preserve">they</w:t>
+      </w:r>
+      <w:r>
+        <w:t xml:space="preserve"> </w:t>
+      </w:r>
+      <w:r>
+        <w:t xml:space="preserve">are.</w:t>
+      </w:r>
+      <w:r>
+        <w:t xml:space="preserve"> </w:t>
+      </w:r>
+      <w:r>
+        <w:t xml:space="preserve">Prescriptive</w:t>
+      </w:r>
+      <w:r>
+        <w:t xml:space="preserve"> </w:t>
+      </w:r>
+      <w:r>
+        <w:t xml:space="preserve">standardization</w:t>
+      </w:r>
+      <w:r>
+        <w:t xml:space="preserve"> </w:t>
+      </w:r>
+      <w:r>
+        <w:t xml:space="preserve">campaigns</w:t>
+      </w:r>
+      <w:r>
+        <w:t xml:space="preserve"> </w:t>
+      </w:r>
+      <w:r>
+        <w:t xml:space="preserve">of</w:t>
+      </w:r>
+      <w:r>
+        <w:t xml:space="preserve"> </w:t>
+      </w:r>
+      <w:r>
+        <w:t xml:space="preserve">the</w:t>
+      </w:r>
+      <w:r>
+        <w:t xml:space="preserve"> </w:t>
+      </w:r>
+      <w:r>
+        <w:t xml:space="preserve">18th</w:t>
+      </w:r>
+      <w:r>
+        <w:t xml:space="preserve"> </w:t>
+      </w:r>
+      <w:r>
+        <w:t xml:space="preserve">and</w:t>
+      </w:r>
+      <w:r>
+        <w:t xml:space="preserve"> </w:t>
+      </w:r>
+      <w:r>
+        <w:t xml:space="preserve">19th</w:t>
+      </w:r>
+      <w:r>
+        <w:t xml:space="preserve"> </w:t>
+      </w:r>
+      <w:r>
+        <w:t xml:space="preserve">centuries,</w:t>
+      </w:r>
+      <w:r>
+        <w:t xml:space="preserve"> </w:t>
+      </w:r>
+      <w:r>
+        <w:t xml:space="preserve">each</w:t>
+      </w:r>
+      <w:r>
+        <w:t xml:space="preserve"> </w:t>
+      </w:r>
+      <w:r>
+        <w:t xml:space="preserve">modeled</w:t>
+      </w:r>
+      <w:r>
+        <w:t xml:space="preserve"> </w:t>
+      </w:r>
+      <w:r>
+        <w:t xml:space="preserve">on</w:t>
+      </w:r>
+      <w:r>
+        <w:t xml:space="preserve"> </w:t>
+      </w:r>
+      <w:r>
+        <w:t xml:space="preserve">Latin</w:t>
+      </w:r>
+      <w:r>
+        <w:t xml:space="preserve"> </w:t>
+      </w:r>
+      <w:r>
+        <w:t xml:space="preserve">or</w:t>
+      </w:r>
+      <w:r>
+        <w:t xml:space="preserve"> </w:t>
+      </w:r>
+      <w:r>
+        <w:t xml:space="preserve">French,</w:t>
+      </w:r>
+      <w:r>
+        <w:t xml:space="preserve"> </w:t>
+      </w:r>
+      <w:r>
+        <w:t xml:space="preserve">systematically</w:t>
+      </w:r>
+      <w:r>
+        <w:t xml:space="preserve"> </w:t>
+      </w:r>
+      <w:r>
+        <w:t xml:space="preserve">suppressed</w:t>
+      </w:r>
+      <w:r>
+        <w:t xml:space="preserve"> </w:t>
+      </w:r>
+      <w:r>
+        <w:t xml:space="preserve">shared</w:t>
+      </w:r>
+      <w:r>
+        <w:t xml:space="preserve"> </w:t>
+      </w:r>
+      <w:r>
+        <w:t xml:space="preserve">Germanic</w:t>
+      </w:r>
+      <w:r>
+        <w:t xml:space="preserve"> </w:t>
+      </w:r>
+      <w:r>
+        <w:t xml:space="preserve">features</w:t>
+      </w:r>
+      <w:r>
+        <w:t xml:space="preserve"> </w:t>
+      </w:r>
+      <w:r>
+        <w:t xml:space="preserve">and</w:t>
+      </w:r>
+      <w:r>
+        <w:t xml:space="preserve"> </w:t>
+      </w:r>
+      <w:r>
+        <w:t xml:space="preserve">amplified</w:t>
+      </w:r>
+      <w:r>
+        <w:t xml:space="preserve"> </w:t>
+      </w:r>
+      <w:r>
+        <w:t xml:space="preserve">the</w:t>
+      </w:r>
+      <w:r>
+        <w:t xml:space="preserve"> </w:t>
+      </w:r>
+      <w:r>
+        <w:t xml:space="preserve">differences.</w:t>
+      </w:r>
+      <w:r>
+        <w:t xml:space="preserve"> </w:t>
+      </w:r>
+      <w:r>
+        <w:t xml:space="preserve">The</w:t>
+      </w:r>
+      <w:r>
+        <w:t xml:space="preserve"> </w:t>
+      </w:r>
+      <w:r>
+        <w:t xml:space="preserve">grammarians</w:t>
+      </w:r>
+      <w:r>
+        <w:t xml:space="preserve"> </w:t>
+      </w:r>
+      <w:r>
+        <w:t xml:space="preserve">widened</w:t>
+      </w:r>
+      <w:r>
+        <w:t xml:space="preserve"> </w:t>
+      </w:r>
+      <w:r>
+        <w:t xml:space="preserve">real</w:t>
+      </w:r>
+      <w:r>
+        <w:t xml:space="preserve"> </w:t>
+      </w:r>
+      <w:r>
+        <w:t xml:space="preserve">gaps</w:t>
+      </w:r>
+      <w:r>
+        <w:t xml:space="preserve"> </w:t>
+      </w:r>
+      <w:r>
+        <w:t xml:space="preserve">into</w:t>
+      </w:r>
+      <w:r>
+        <w:t xml:space="preserve"> </w:t>
+      </w:r>
+      <w:r>
+        <w:t xml:space="preserve">apparent</w:t>
+      </w:r>
+      <w:r>
+        <w:t xml:space="preserve"> </w:t>
+      </w:r>
+      <w:r>
+        <w:t xml:space="preserve">chasms.</w:t>
+      </w:r>
+    </w:p>
+    <w:p>
+      <w:pPr>
+        <w:pStyle w:val="Abstract"/>
+      </w:pPr>
+      <w:r>
+        <w:t xml:space="preserve">Entfesselt</w:t>
+      </w:r>
+      <w:r>
+        <w:t xml:space="preserve"> </w:t>
+      </w:r>
+      <w:r>
+        <w:t xml:space="preserve">(unfettered)</w:t>
+      </w:r>
+      <w:r>
+        <w:t xml:space="preserve"> </w:t>
+      </w:r>
+      <w:r>
+        <w:t xml:space="preserve">is</w:t>
+      </w:r>
+      <w:r>
+        <w:t xml:space="preserve"> </w:t>
+      </w:r>
+      <w:r>
+        <w:t xml:space="preserve">a</w:t>
+      </w:r>
+      <w:r>
+        <w:t xml:space="preserve"> </w:t>
+      </w:r>
+      <w:r>
+        <w:t xml:space="preserve">rule-based</w:t>
+      </w:r>
+      <w:r>
+        <w:t xml:space="preserve"> </w:t>
+      </w:r>
+      <w:r>
+        <w:t xml:space="preserve">methodology</w:t>
+      </w:r>
+      <w:r>
+        <w:t xml:space="preserve"> </w:t>
+      </w:r>
+      <w:r>
+        <w:t xml:space="preserve">for</w:t>
+      </w:r>
+      <w:r>
+        <w:t xml:space="preserve"> </w:t>
+      </w:r>
+      <w:r>
+        <w:t xml:space="preserve">reversing</w:t>
+      </w:r>
+      <w:r>
+        <w:t xml:space="preserve"> </w:t>
+      </w:r>
+      <w:r>
+        <w:t xml:space="preserve">those</w:t>
+      </w:r>
+      <w:r>
+        <w:t xml:space="preserve"> </w:t>
+      </w:r>
+      <w:r>
+        <w:t xml:space="preserve">impositions:</w:t>
+      </w:r>
+      <w:r>
+        <w:t xml:space="preserve"> </w:t>
+      </w:r>
+      <w:r>
+        <w:t xml:space="preserve">identifying</w:t>
+      </w:r>
+      <w:r>
+        <w:t xml:space="preserve"> </w:t>
+      </w:r>
+      <w:r>
+        <w:t xml:space="preserve">what</w:t>
+      </w:r>
+      <w:r>
+        <w:t xml:space="preserve"> </w:t>
+      </w:r>
+      <w:r>
+        <w:t xml:space="preserve">was</w:t>
+      </w:r>
+      <w:r>
+        <w:t xml:space="preserve"> </w:t>
+      </w:r>
+      <w:r>
+        <w:t xml:space="preserve">suppressed,</w:t>
+      </w:r>
+      <w:r>
+        <w:t xml:space="preserve"> </w:t>
+      </w:r>
+      <w:r>
+        <w:t xml:space="preserve">why,</w:t>
+      </w:r>
+      <w:r>
+        <w:t xml:space="preserve"> </w:t>
+      </w:r>
+      <w:r>
+        <w:t xml:space="preserve">and</w:t>
+      </w:r>
+      <w:r>
+        <w:t xml:space="preserve"> </w:t>
+      </w:r>
+      <w:r>
+        <w:t xml:space="preserve">what</w:t>
+      </w:r>
+      <w:r>
+        <w:t xml:space="preserve"> </w:t>
+      </w:r>
+      <w:r>
+        <w:t xml:space="preserve">the</w:t>
+      </w:r>
+      <w:r>
+        <w:t xml:space="preserve"> </w:t>
+      </w:r>
+      <w:r>
+        <w:t xml:space="preserve">language</w:t>
+      </w:r>
+      <w:r>
+        <w:t xml:space="preserve"> </w:t>
+      </w:r>
+      <w:r>
+        <w:t xml:space="preserve">looks</w:t>
+      </w:r>
+      <w:r>
+        <w:t xml:space="preserve"> </w:t>
+      </w:r>
+      <w:r>
+        <w:t xml:space="preserve">like</w:t>
+      </w:r>
+      <w:r>
+        <w:t xml:space="preserve"> </w:t>
+      </w:r>
+      <w:r>
+        <w:t xml:space="preserve">restored.</w:t>
+      </w:r>
+      <w:r>
+        <w:t xml:space="preserve"> </w:t>
+      </w:r>
+      <w:r>
+        <w:t xml:space="preserve">The</w:t>
+      </w:r>
+      <w:r>
+        <w:t xml:space="preserve"> </w:t>
+      </w:r>
+      <w:r>
+        <w:t xml:space="preserve">suppressed</w:t>
+      </w:r>
+      <w:r>
+        <w:t xml:space="preserve"> </w:t>
+      </w:r>
+      <w:r>
+        <w:t xml:space="preserve">features</w:t>
+      </w:r>
+      <w:r>
+        <w:t xml:space="preserve"> </w:t>
+      </w:r>
+      <w:r>
+        <w:t xml:space="preserve">include</w:t>
+      </w:r>
+      <w:r>
+        <w:t xml:space="preserve"> </w:t>
+      </w:r>
+      <w:r>
+        <w:t xml:space="preserve">flexible</w:t>
+      </w:r>
+      <w:r>
+        <w:t xml:space="preserve"> </w:t>
+      </w:r>
+      <w:r>
+        <w:t xml:space="preserve">word</w:t>
+      </w:r>
+      <w:r>
+        <w:t xml:space="preserve"> </w:t>
+      </w:r>
+      <w:r>
+        <w:t xml:space="preserve">order,</w:t>
+      </w:r>
+      <w:r>
+        <w:t xml:space="preserve"> </w:t>
+      </w:r>
+      <w:r>
+        <w:t xml:space="preserve">periphrastic</w:t>
+      </w:r>
+      <w:r>
+        <w:t xml:space="preserve"> </w:t>
+      </w:r>
+      <w:r>
+        <w:t xml:space="preserve">do-support,</w:t>
+      </w:r>
+      <w:r>
+        <w:t xml:space="preserve"> </w:t>
+      </w:r>
+      <w:r>
+        <w:t xml:space="preserve">two-element</w:t>
+      </w:r>
+      <w:r>
+        <w:t xml:space="preserve"> </w:t>
+      </w:r>
+      <w:r>
+        <w:t xml:space="preserve">compound</w:t>
+      </w:r>
+      <w:r>
+        <w:t xml:space="preserve"> </w:t>
+      </w:r>
+      <w:r>
+        <w:t xml:space="preserve">formation,</w:t>
+      </w:r>
+      <w:r>
+        <w:t xml:space="preserve"> </w:t>
+      </w:r>
+      <w:r>
+        <w:t xml:space="preserve">and</w:t>
+      </w:r>
+      <w:r>
+        <w:t xml:space="preserve"> </w:t>
+      </w:r>
+      <w:r>
+        <w:t xml:space="preserve">analytic</w:t>
+      </w:r>
+      <w:r>
+        <w:t xml:space="preserve"> </w:t>
+      </w:r>
+      <w:r>
+        <w:t xml:space="preserve">possession;</w:t>
+      </w:r>
+      <w:r>
+        <w:t xml:space="preserve"> </w:t>
+      </w:r>
+      <w:r>
+        <w:t xml:space="preserve">the</w:t>
+      </w:r>
+      <w:r>
+        <w:t xml:space="preserve"> </w:t>
+      </w:r>
+      <w:r>
+        <w:t xml:space="preserve">amplified</w:t>
+      </w:r>
+      <w:r>
+        <w:t xml:space="preserve"> </w:t>
+      </w:r>
+      <w:r>
+        <w:t xml:space="preserve">features</w:t>
+      </w:r>
+      <w:r>
+        <w:t xml:space="preserve"> </w:t>
+      </w:r>
+      <w:r>
+        <w:t xml:space="preserve">include</w:t>
+      </w:r>
+      <w:r>
+        <w:t xml:space="preserve"> </w:t>
+      </w:r>
+      <w:r>
+        <w:t xml:space="preserve">recursive</w:t>
+      </w:r>
+      <w:r>
+        <w:t xml:space="preserve"> </w:t>
+      </w:r>
+      <w:r>
+        <w:t xml:space="preserve">compounding,</w:t>
+      </w:r>
+      <w:r>
+        <w:t xml:space="preserve"> </w:t>
+      </w:r>
+      <w:r>
+        <w:t xml:space="preserve">verb-final</w:t>
+      </w:r>
+      <w:r>
+        <w:t xml:space="preserve"> </w:t>
+      </w:r>
+      <w:r>
+        <w:t xml:space="preserve">subordination,</w:t>
+      </w:r>
+      <w:r>
+        <w:t xml:space="preserve"> </w:t>
+      </w:r>
+      <w:r>
+        <w:t xml:space="preserve">and</w:t>
+      </w:r>
+      <w:r>
+        <w:t xml:space="preserve"> </w:t>
+      </w:r>
+      <w:r>
+        <w:t xml:space="preserve">synthetic</w:t>
+      </w:r>
+      <w:r>
+        <w:t xml:space="preserve"> </w:t>
+      </w:r>
+      <w:r>
+        <w:t xml:space="preserve">case</w:t>
+      </w:r>
+      <w:r>
+        <w:t xml:space="preserve"> </w:t>
+      </w:r>
+      <w:r>
+        <w:t xml:space="preserve">marking.</w:t>
+      </w:r>
+      <w:r>
+        <w:t xml:space="preserve"> </w:t>
+      </w:r>
+      <w:r>
+        <w:t xml:space="preserve">Applied</w:t>
+      </w:r>
+      <w:r>
+        <w:t xml:space="preserve"> </w:t>
+      </w:r>
+      <w:r>
+        <w:t xml:space="preserve">to</w:t>
+      </w:r>
+      <w:r>
+        <w:t xml:space="preserve"> </w:t>
+      </w:r>
+      <w:r>
+        <w:t xml:space="preserve">German</w:t>
+      </w:r>
+      <w:r>
+        <w:t xml:space="preserve"> </w:t>
+      </w:r>
+      <w:r>
+        <w:t xml:space="preserve">in</w:t>
+      </w:r>
+      <w:r>
+        <w:t xml:space="preserve"> </w:t>
+      </w:r>
+      <w:r>
+        <w:t xml:space="preserve">full,</w:t>
       </w:r>
       <w:r>
         <w:t xml:space="preserve"> </w:t>
@@ -75,19 +787,295 @@
         <w:t xml:space="preserve"> </w:t>
       </w:r>
       <w:r>
-        <w:t xml:space="preserve">your</w:t>
-      </w:r>
-      <w:r>
-        <w:t xml:space="preserve"> </w:t>
-      </w:r>
-      <w:r>
-        <w:t xml:space="preserve">executive</w:t>
-      </w:r>
-      <w:r>
-        <w:t xml:space="preserve"> </w:t>
-      </w:r>
-      <w:r>
-        <w:t xml:space="preserve">summary.]</w:t>
+        <w:t xml:space="preserve">extensions</w:t>
+      </w:r>
+      <w:r>
+        <w:t xml:space="preserve"> </w:t>
+      </w:r>
+      <w:r>
+        <w:t xml:space="preserve">to</w:t>
+      </w:r>
+      <w:r>
+        <w:t xml:space="preserve"> </w:t>
+      </w:r>
+      <w:r>
+        <w:t xml:space="preserve">Dutch,</w:t>
+      </w:r>
+      <w:r>
+        <w:t xml:space="preserve"> </w:t>
+      </w:r>
+      <w:r>
+        <w:t xml:space="preserve">Danish,</w:t>
+      </w:r>
+      <w:r>
+        <w:t xml:space="preserve"> </w:t>
+      </w:r>
+      <w:r>
+        <w:t xml:space="preserve">Swedish,</w:t>
+      </w:r>
+      <w:r>
+        <w:t xml:space="preserve"> </w:t>
+      </w:r>
+      <w:r>
+        <w:t xml:space="preserve">Norwegian,</w:t>
+      </w:r>
+      <w:r>
+        <w:t xml:space="preserve"> </w:t>
+      </w:r>
+      <w:r>
+        <w:t xml:space="preserve">Icelandic,</w:t>
+      </w:r>
+      <w:r>
+        <w:t xml:space="preserve"> </w:t>
+      </w:r>
+      <w:r>
+        <w:t xml:space="preserve">Faroese,</w:t>
+      </w:r>
+      <w:r>
+        <w:t xml:space="preserve"> </w:t>
+      </w:r>
+      <w:r>
+        <w:t xml:space="preserve">Frisian,</w:t>
+      </w:r>
+      <w:r>
+        <w:t xml:space="preserve"> </w:t>
+      </w:r>
+      <w:r>
+        <w:t xml:space="preserve">Afrikaans,</w:t>
+      </w:r>
+      <w:r>
+        <w:t xml:space="preserve"> </w:t>
+      </w:r>
+      <w:r>
+        <w:t xml:space="preserve">Yiddish,</w:t>
+      </w:r>
+      <w:r>
+        <w:t xml:space="preserve"> </w:t>
+      </w:r>
+      <w:r>
+        <w:t xml:space="preserve">Plautdietsch,</w:t>
+      </w:r>
+      <w:r>
+        <w:t xml:space="preserve"> </w:t>
+      </w:r>
+      <w:r>
+        <w:t xml:space="preserve">and</w:t>
+      </w:r>
+      <w:r>
+        <w:t xml:space="preserve"> </w:t>
+      </w:r>
+      <w:r>
+        <w:t xml:space="preserve">Scots,</w:t>
+      </w:r>
+      <w:r>
+        <w:t xml:space="preserve"> </w:t>
+      </w:r>
+      <w:r>
+        <w:t xml:space="preserve">when</w:t>
+      </w:r>
+      <w:r>
+        <w:t xml:space="preserve"> </w:t>
+      </w:r>
+      <w:r>
+        <w:t xml:space="preserve">the</w:t>
+      </w:r>
+      <w:r>
+        <w:t xml:space="preserve"> </w:t>
+      </w:r>
+      <w:r>
+        <w:t xml:space="preserve">imposed</w:t>
+      </w:r>
+      <w:r>
+        <w:t xml:space="preserve"> </w:t>
+      </w:r>
+      <w:r>
+        <w:t xml:space="preserve">grammar</w:t>
+      </w:r>
+      <w:r>
+        <w:t xml:space="preserve"> </w:t>
+      </w:r>
+      <w:r>
+        <w:t xml:space="preserve">is</w:t>
+      </w:r>
+      <w:r>
+        <w:t xml:space="preserve"> </w:t>
+      </w:r>
+      <w:r>
+        <w:t xml:space="preserve">removed,</w:t>
+      </w:r>
+      <w:r>
+        <w:t xml:space="preserve"> </w:t>
+      </w:r>
+      <w:r>
+        <w:t xml:space="preserve">the</w:t>
+      </w:r>
+      <w:r>
+        <w:t xml:space="preserve"> </w:t>
+      </w:r>
+      <w:r>
+        <w:t xml:space="preserve">family</w:t>
+      </w:r>
+      <w:r>
+        <w:t xml:space="preserve"> </w:t>
+      </w:r>
+      <w:r>
+        <w:t xml:space="preserve">resemblance</w:t>
+      </w:r>
+      <w:r>
+        <w:t xml:space="preserve"> </w:t>
+      </w:r>
+      <w:r>
+        <w:t xml:space="preserve">shows</w:t>
+      </w:r>
+      <w:r>
+        <w:t xml:space="preserve"> </w:t>
+      </w:r>
+      <w:r>
+        <w:t xml:space="preserve">through</w:t>
+      </w:r>
+      <w:r>
+        <w:t xml:space="preserve"> </w:t>
+      </w:r>
+      <w:r>
+        <w:t xml:space="preserve">in</w:t>
+      </w:r>
+      <w:r>
+        <w:t xml:space="preserve"> </w:t>
+      </w:r>
+      <w:r>
+        <w:t xml:space="preserve">every</w:t>
+      </w:r>
+      <w:r>
+        <w:t xml:space="preserve"> </w:t>
+      </w:r>
+      <w:r>
+        <w:t xml:space="preserve">sentence.</w:t>
+      </w:r>
+      <w:r>
+        <w:t xml:space="preserve"> </w:t>
+      </w:r>
+      <w:r>
+        <w:t xml:space="preserve">None</w:t>
+      </w:r>
+      <w:r>
+        <w:t xml:space="preserve"> </w:t>
+      </w:r>
+      <w:r>
+        <w:t xml:space="preserve">of</w:t>
+      </w:r>
+      <w:r>
+        <w:t xml:space="preserve"> </w:t>
+      </w:r>
+      <w:r>
+        <w:t xml:space="preserve">these</w:t>
+      </w:r>
+      <w:r>
+        <w:t xml:space="preserve"> </w:t>
+      </w:r>
+      <w:r>
+        <w:t xml:space="preserve">languages</w:t>
+      </w:r>
+      <w:r>
+        <w:t xml:space="preserve"> </w:t>
+      </w:r>
+      <w:r>
+        <w:t xml:space="preserve">have</w:t>
+      </w:r>
+      <w:r>
+        <w:t xml:space="preserve"> </w:t>
+      </w:r>
+      <w:r>
+        <w:t xml:space="preserve">diverged</w:t>
+      </w:r>
+      <w:r>
+        <w:t xml:space="preserve"> </w:t>
+      </w:r>
+      <w:r>
+        <w:t xml:space="preserve">as</w:t>
+      </w:r>
+      <w:r>
+        <w:t xml:space="preserve"> </w:t>
+      </w:r>
+      <w:r>
+        <w:t xml:space="preserve">far</w:t>
+      </w:r>
+      <w:r>
+        <w:t xml:space="preserve"> </w:t>
+      </w:r>
+      <w:r>
+        <w:t xml:space="preserve">from</w:t>
+      </w:r>
+      <w:r>
+        <w:t xml:space="preserve"> </w:t>
+      </w:r>
+      <w:r>
+        <w:t xml:space="preserve">their</w:t>
+      </w:r>
+      <w:r>
+        <w:t xml:space="preserve"> </w:t>
+      </w:r>
+      <w:r>
+        <w:t xml:space="preserve">Old</w:t>
+      </w:r>
+      <w:r>
+        <w:t xml:space="preserve"> </w:t>
+      </w:r>
+      <w:r>
+        <w:t xml:space="preserve">Norse,</w:t>
+      </w:r>
+      <w:r>
+        <w:t xml:space="preserve"> </w:t>
+      </w:r>
+      <w:r>
+        <w:t xml:space="preserve">Old</w:t>
+      </w:r>
+      <w:r>
+        <w:t xml:space="preserve"> </w:t>
+      </w:r>
+      <w:r>
+        <w:t xml:space="preserve">English,</w:t>
+      </w:r>
+      <w:r>
+        <w:t xml:space="preserve"> </w:t>
+      </w:r>
+      <w:r>
+        <w:t xml:space="preserve">and</w:t>
+      </w:r>
+      <w:r>
+        <w:t xml:space="preserve"> </w:t>
+      </w:r>
+      <w:r>
+        <w:t xml:space="preserve">Gothic</w:t>
+      </w:r>
+      <w:r>
+        <w:t xml:space="preserve"> </w:t>
+      </w:r>
+      <w:r>
+        <w:t xml:space="preserve">origins</w:t>
+      </w:r>
+      <w:r>
+        <w:t xml:space="preserve"> </w:t>
+      </w:r>
+      <w:r>
+        <w:t xml:space="preserve">as</w:t>
+      </w:r>
+      <w:r>
+        <w:t xml:space="preserve"> </w:t>
+      </w:r>
+      <w:r>
+        <w:t xml:space="preserve">standard</w:t>
+      </w:r>
+      <w:r>
+        <w:t xml:space="preserve"> </w:t>
+      </w:r>
+      <w:r>
+        <w:t xml:space="preserve">grammars</w:t>
+      </w:r>
+      <w:r>
+        <w:t xml:space="preserve"> </w:t>
+      </w:r>
+      <w:r>
+        <w:t xml:space="preserve">suggest.</w:t>
       </w:r>
     </w:p>
     <w:bookmarkStart w:id="20" w:name="introduction"/>

</xml_diff>